<commit_message>
Use scored top-500 candidate pools
</commit_message>
<xml_diff>
--- a/paper/review_en.docx
+++ b/paper/review_en.docx
@@ -25,7 +25,7 @@
     </w:p>
     <w:p>
       <w:r>
-        <w:t>This draft review maps Brain-Computer Interface (BCI) research from 2020 through 2026, selecting up to 100 papers per year from free public Semantic Scholar metadata. Candidate papers were retrieved with BCI-related queries, filtered by target year and relevance terms, deduplicated, and ranked by citation count. The resulting collection highlights work on motor imagery and movement decoding, SSVEP/P300/ERP systems, rehabilitation and neuroprosthetics, invasive interfaces, deep learning, EEG signal processing, speech and communication BCIs, and hybrid or closed-loop systems.</w:t>
+        <w:t>This draft review maps Brain-Computer Interface (BCI) research from 2020 through 2026, investigating up to 500 candidate papers per year from free public Semantic Scholar metadata and selecting 100 papers per year by importance score. Candidate papers were retrieved with BCI-related queries, filtered by target year and strengthened BCI relevance terms, deduplicated, and scored for importance. The resulting collection highlights work on motor imagery and movement decoding, SSVEP/P300/ERP systems, rehabilitation and neuroprosthetics, invasive interfaces, deep learning, EEG signal processing, speech and communication BCIs, and hybrid or closed-loop systems.</w:t>
       </w:r>
     </w:p>
     <w:p>
@@ -38,7 +38,7 @@
     </w:p>
     <w:p>
       <w:r>
-        <w:t>Methods: For each year, BCI-oriented queries were sent to the Semantic Scholar Academic Graph bulk search endpoint. Records were retained when their title or abstract matched BCI relevance expressions, deduplicated by DOI, arXiv, PubMed, CorpusId, or paperId, and sorted by citationCount. The year 2026 should be interpreted as a partial year as of 2026-06-25.</w:t>
+        <w:t>Methods: For each year, BCI-oriented queries were sent to the Semantic Scholar Academic Graph bulk search endpoint. Records were retained when their title or abstract matched BCI relevance expressions, deduplicated by DOI, arXiv, PubMed, CorpusId, or paperId, and reduced to at most 500 candidate papers per year. The final 100 papers per year were selected by an importance score that combines log-scaled citations, log-scaled influential citations, recognized venue signals, BCI relevance-term density, and bonuses for reviews/surveys, datasets/benchmarks, clinical or rehabilitation relevance, invasive high-bandwidth BCIs, and modern machine-learning methods. The year 2026 should be interpreted as a partial year as of 2026-06-25.</w:t>
       </w:r>
     </w:p>
     <w:p>
@@ -54,7 +54,7 @@
         <w:pStyle w:val="ListBullet"/>
       </w:pPr>
       <w:r>
-        <w:t>Motor Imagery and Movement Decoding: 364</w:t>
+        <w:t>Motor Imagery and Movement Decoding: 476</w:t>
       </w:r>
     </w:p>
     <w:p>
@@ -62,7 +62,7 @@
         <w:pStyle w:val="ListBullet"/>
       </w:pPr>
       <w:r>
-        <w:t>Invasive and Implantable Interfaces: 98</w:t>
+        <w:t>SSVEP, P300, and ERP Spellers: 99</w:t>
       </w:r>
     </w:p>
     <w:p>
@@ -70,7 +70,7 @@
         <w:pStyle w:val="ListBullet"/>
       </w:pPr>
       <w:r>
-        <w:t>SSVEP, P300, and ERP Spellers: 76</w:t>
+        <w:t>Invasive and Implantable Interfaces: 39</w:t>
       </w:r>
     </w:p>
     <w:p>
@@ -78,7 +78,7 @@
         <w:pStyle w:val="ListBullet"/>
       </w:pPr>
       <w:r>
-        <w:t>EEG Signal Processing and Datasets: 55</w:t>
+        <w:t>EEG Signal Processing and Datasets: 29</w:t>
       </w:r>
     </w:p>
     <w:p>
@@ -86,7 +86,7 @@
         <w:pStyle w:val="ListBullet"/>
       </w:pPr>
       <w:r>
-        <w:t>Rehabilitation and Neuroprosthetics: 37</w:t>
+        <w:t>Rehabilitation and Neuroprosthetics: 21</w:t>
       </w:r>
     </w:p>
     <w:p>
@@ -94,7 +94,7 @@
         <w:pStyle w:val="ListBullet"/>
       </w:pPr>
       <w:r>
-        <w:t>Deep Learning and Representation Learning: 27</w:t>
+        <w:t>General BCI Methods and Systems: 14</w:t>
       </w:r>
     </w:p>
     <w:p>
@@ -102,7 +102,7 @@
         <w:pStyle w:val="ListBullet"/>
       </w:pPr>
       <w:r>
-        <w:t>General BCI Methods and Systems: 22</w:t>
+        <w:t>Deep Learning and Representation Learning: 12</w:t>
       </w:r>
     </w:p>
     <w:p>
@@ -110,7 +110,7 @@
         <w:pStyle w:val="ListBullet"/>
       </w:pPr>
       <w:r>
-        <w:t>Speech, Language, and Communication BCIs: 16</w:t>
+        <w:t>Speech, Language, and Communication BCIs: 7</w:t>
       </w:r>
     </w:p>
     <w:p>
@@ -118,7 +118,7 @@
         <w:pStyle w:val="ListBullet"/>
       </w:pPr>
       <w:r>
-        <w:t>Hybrid, Affective, and Closed-loop BCIs: 5</w:t>
+        <w:t>Hybrid, Affective, and Closed-loop BCIs: 3</w:t>
       </w:r>
     </w:p>
     <w:p>
@@ -139,7 +139,7 @@
         <w:pStyle w:val="ListBullet"/>
       </w:pPr>
       <w:r>
-        <w:t>2020: 100 papers, 15,059 citations in selected set, top paper: Brain-Computer Interfaces</w:t>
+        <w:t>2020: 100 papers, 10,957 citations in selected set, top paper: Current Status, Challenges, and Possible Solutions of EEG-Based Brain-Computer Interface: A Comprehensive Review</w:t>
       </w:r>
     </w:p>
     <w:p>
@@ -147,7 +147,7 @@
         <w:pStyle w:val="ListBullet"/>
       </w:pPr>
       <w:r>
-        <w:t>2021: 100 papers, 12,777 citations in selected set, top paper: High-performance brain-to-text communication via handwriting</w:t>
+        <w:t>2021: 100 papers, 8,999 citations in selected set, top paper: A brain-computer interface that evokes tactile sensations improves robotic arm control</w:t>
       </w:r>
     </w:p>
     <w:p>
@@ -155,7 +155,7 @@
         <w:pStyle w:val="ListBullet"/>
       </w:pPr>
       <w:r>
-        <w:t>2022: 100 papers, 8,860 citations in selected set, top paper: Human emotion recognition from EEG-based brain–computer interface using machine learning: a comprehensive review</w:t>
+        <w:t>2022: 100 papers, 6,112 citations in selected set, top paper: FBMSNet: A Filter-Bank Multi-Scale Convolutional Neural Network for EEG-Based Motor Imagery Decoding</w:t>
       </w:r>
     </w:p>
     <w:p>
@@ -163,7 +163,7 @@
         <w:pStyle w:val="ListBullet"/>
       </w:pPr>
       <w:r>
-        <w:t>2023: 100 papers, 8,406 citations in selected set, top paper: EEG-Based Emotion Recognition via Channel-Wise Attention and Self Attention</w:t>
+        <w:t>2023: 100 papers, 4,932 citations in selected set, top paper: Physics-Informed Attention Temporal Convolutional Network for EEG-Based Motor Imagery Classification</w:t>
       </w:r>
     </w:p>
     <w:p>
@@ -171,7 +171,7 @@
         <w:pStyle w:val="ListBullet"/>
       </w:pPr>
       <w:r>
-        <w:t>2024: 100 papers, 5,471 citations in selected set, top paper: Large Brain Model for Learning Generic Representations with Tremendous EEG Data in BCI</w:t>
+        <w:t>2024: 100 papers, 3,461 citations in selected set, top paper: Large Brain Model for Learning Generic Representations with Tremendous EEG Data in BCI</w:t>
       </w:r>
     </w:p>
     <w:p>
@@ -179,7 +179,7 @@
         <w:pStyle w:val="ListBullet"/>
       </w:pPr>
       <w:r>
-        <w:t>2025: 100 papers, 2,273 citations in selected set, top paper: Recent applications of EEG-based brain-computer-interface in the medical field</w:t>
+        <w:t>2025: 100 papers, 1,397 citations in selected set, top paper: EEG-based brain-computer interface enables real-time robotic hand control at individual finger level</w:t>
       </w:r>
     </w:p>
     <w:p>
@@ -187,7 +187,7 @@
         <w:pStyle w:val="ListBullet"/>
       </w:pPr>
       <w:r>
-        <w:t>2026: 100 papers, 189 citations in selected set, top paper: EEG Foundation Models: Progresses, Benchmarking, and Open Problems</w:t>
+        <w:t>2026: 100 papers, 102 citations in selected set, top paper: Toward Robust, Reproducible, and Widely Accessible Intracranial Language Brain-Computer Interfaces: A Comprehensive Review of Neural Mechanisms, Hardware, Algorithms, Evaluation, Clinical Pathways and Future Directions</w:t>
       </w:r>
     </w:p>
     <w:p>
@@ -229,7 +229,7 @@
         <w:pStyle w:val="ListNumber"/>
       </w:pPr>
       <w:r>
-        <w:t>Ricardo Chavarriaga, J. Millán. (2020). Brain-Computer Interfaces. Handbook of Clinical Neurology. https://doi.org/10.1007/978-3-540-29678-2_717</w:t>
+        <w:t>M. Rashid, N. Sulaiman, A. P. Majeed, R. Musa, A. Nasir, Bifta Sama Bari, et al.. (2020). Current Status, Challenges, and Possible Solutions of EEG-Based Brain-Computer Interface: A Comprehensive Review. Frontiers in Neurorobotics. https://doi.org/10.3389/fnbot.2020.00025</w:t>
       </w:r>
     </w:p>
     <w:p>
@@ -237,7 +237,7 @@
         <w:pStyle w:val="ListNumber"/>
       </w:pPr>
       <w:r>
-        <w:t>Francis R. Willett, Donald T. Avansino, L. Hochberg, J. Henderson, K. Shenoy. (2021). High-performance brain-to-text communication via handwriting. Nature. https://doi.org/10.1038/s41586-021-03506-2</w:t>
+        <w:t>Sharlene N. Flesher, J. Downey, Jeffrey M. Weiss, Christopher L. Hughes, Angelica J. Herrera, E. Tyler-Kabara, et al.. (2021). A brain-computer interface that evokes tactile sensations improves robotic arm control. Science. https://doi.org/10.1126/science.abd0380</w:t>
       </w:r>
     </w:p>
     <w:p>
@@ -245,7 +245,7 @@
         <w:pStyle w:val="ListNumber"/>
       </w:pPr>
       <w:r>
-        <w:t>Essam H. Houssein, A. Hammad, Abdelmgeid A. Ali. (2022). Human emotion recognition from EEG-based brain–computer interface using machine learning: a comprehensive review. Neural computing &amp; applications (Print). https://doi.org/10.1007/s00521-022-07292-4</w:t>
+        <w:t>Ke Liu, Mingzhao Yang, Zhuliang Yu, Guoyin Wang, Wei Wu. (2022). FBMSNet: A Filter-Bank Multi-Scale Convolutional Neural Network for EEG-Based Motor Imagery Decoding. IEEE Transactions on Biomedical Engineering. https://doi.org/10.1109/TBME.2022.3193277</w:t>
       </w:r>
     </w:p>
     <w:p>
@@ -253,7 +253,7 @@
         <w:pStyle w:val="ListNumber"/>
       </w:pPr>
       <w:r>
-        <w:t>Wei Tao, Chang Li, Rencheng Song, Juan Cheng, Yu Liu, Feng Wan, et al.. (2023). EEG-Based Emotion Recognition via Channel-Wise Attention and Self Attention. IEEE Transactions on Affective Computing. https://doi.org/10.1109/TAFFC.2020.3025777</w:t>
+        <w:t>Hamdi Altaheri, G. Muhammad, Mansour Alsulaiman. (2023). Physics-Informed Attention Temporal Convolutional Network for EEG-Based Motor Imagery Classification. IEEE Transactions on Industrial Informatics. https://doi.org/10.1109/TII.2022.3197419</w:t>
       </w:r>
     </w:p>
     <w:p>
@@ -269,7 +269,7 @@
         <w:pStyle w:val="ListNumber"/>
       </w:pPr>
       <w:r>
-        <w:t>Xiuyun Liu, Wen-long Wang, Miao Liu, Mingyi Chen, Tânia Pereira, Desta Yakob Doda, et al.. (2025). Recent applications of EEG-based brain-computer-interface in the medical field. Military Medical Research. https://doi.org/10.1186/s40779-025-00598-z</w:t>
+        <w:t>Yidan Ding, Chalisa Udompanyawit, Yisha Zhang, B. He. (2025). EEG-based brain-computer interface enables real-time robotic hand control at individual finger level. Nature Communications. https://doi.org/10.1038/s41467-025-61064-x</w:t>
       </w:r>
     </w:p>
     <w:p>
@@ -277,7 +277,7 @@
         <w:pStyle w:val="ListNumber"/>
       </w:pPr>
       <w:r>
-        <w:t>Dingkun Liu, Yuheng Chen, Zhu Chen, Zhenyao Cui, Yaozhi Wen, Jiayu An, et al.. (2026). EEG Foundation Models: Progresses, Benchmarking, and Open Problems. arXiv.org. https://doi.org/10.48550/arXiv.2601.17883</w:t>
+        <w:t>Dongyi He, W. Siok, Nizhuan Wang. (2026). Toward Robust, Reproducible, and Widely Accessible Intracranial Language Brain-Computer Interfaces: A Comprehensive Review of Neural Mechanisms, Hardware, Algorithms, Evaluation, Clinical Pathways and Future Directions. Unknown venue. https://arxiv.org/abs/2603.12279</w:t>
       </w:r>
     </w:p>
     <w:sectPr>

</xml_diff>

<commit_message>
Expand review paper analysis
</commit_message>
<xml_diff>
--- a/paper/review_en.docx
+++ b/paper/review_en.docx
@@ -46,7 +46,47 @@
         <w:pStyle w:val="Heading1"/>
       </w:pPr>
       <w:r>
-        <w:t>2. Taxonomy</w:t>
+        <w:t>2. Key Findings</w:t>
+      </w:r>
+    </w:p>
+    <w:p>
+      <w:pPr>
+        <w:pStyle w:val="ListBullet"/>
+      </w:pPr>
+      <w:r>
+        <w:t>The 700 selected papers account for 35,960 citations in the selected set, with the largest citation mass in 2020.</w:t>
+      </w:r>
+    </w:p>
+    <w:p>
+      <w:pPr>
+        <w:pStyle w:val="ListBullet"/>
+      </w:pPr>
+      <w:r>
+        <w:t>The dominant category is Motor Imagery and Movement Decoding (476 papers), indicating that movement intention decoding and motor assistance remain the organizing center of 2020s BCI research.</w:t>
+      </w:r>
+    </w:p>
+    <w:p>
+      <w:pPr>
+        <w:pStyle w:val="ListBullet"/>
+      </w:pPr>
+      <w:r>
+        <w:t>Papers from 2026 are structurally citation-disadvantaged because the year is partial, but they surface emerging themes around foundation models, stability, invasive high-bandwidth decoding, and clinical translation.</w:t>
+      </w:r>
+    </w:p>
+    <w:p>
+      <w:pPr>
+        <w:pStyle w:val="ListBullet"/>
+      </w:pPr>
+      <w:r>
+        <w:t>Non-invasive EEG-BCI work is increasingly shaped by datasets, benchmarks, and deep learning, while invasive BCI work is moving from peak decoding performance toward communication, autonomy, and usability constraints.</w:t>
+      </w:r>
+    </w:p>
+    <w:p>
+      <w:pPr>
+        <w:pStyle w:val="Heading1"/>
+      </w:pPr>
+      <w:r>
+        <w:t>3. Taxonomy</w:t>
       </w:r>
     </w:p>
     <w:p>
@@ -126,7 +166,87 @@
         <w:pStyle w:val="Heading1"/>
       </w:pPr>
       <w:r>
-        <w:t>3. Year-by-Year Trends</w:t>
+        <w:t>4. Category-Level Interpretation</w:t>
+      </w:r>
+    </w:p>
+    <w:p>
+      <w:pPr>
+        <w:pStyle w:val="ListBullet"/>
+      </w:pPr>
+      <w:r>
+        <w:t>Motor Imagery and Movement Decoding: 476 papers, representing 68.0% of the selected set.</w:t>
+      </w:r>
+    </w:p>
+    <w:p>
+      <w:pPr>
+        <w:pStyle w:val="ListBullet"/>
+      </w:pPr>
+      <w:r>
+        <w:t>SSVEP, P300, and ERP Spellers: 99 papers, representing 14.1% of the selected set.</w:t>
+      </w:r>
+    </w:p>
+    <w:p>
+      <w:pPr>
+        <w:pStyle w:val="ListBullet"/>
+      </w:pPr>
+      <w:r>
+        <w:t>Invasive and Implantable Interfaces: 39 papers, representing 5.6% of the selected set.</w:t>
+      </w:r>
+    </w:p>
+    <w:p>
+      <w:pPr>
+        <w:pStyle w:val="ListBullet"/>
+      </w:pPr>
+      <w:r>
+        <w:t>EEG Signal Processing and Datasets: 29 papers, representing 4.1% of the selected set.</w:t>
+      </w:r>
+    </w:p>
+    <w:p>
+      <w:pPr>
+        <w:pStyle w:val="ListBullet"/>
+      </w:pPr>
+      <w:r>
+        <w:t>Rehabilitation and Neuroprosthetics: 21 papers, representing 3.0% of the selected set.</w:t>
+      </w:r>
+    </w:p>
+    <w:p>
+      <w:pPr>
+        <w:pStyle w:val="ListBullet"/>
+      </w:pPr>
+      <w:r>
+        <w:t>General BCI Methods and Systems: 14 papers, representing 2.0% of the selected set.</w:t>
+      </w:r>
+    </w:p>
+    <w:p>
+      <w:pPr>
+        <w:pStyle w:val="ListBullet"/>
+      </w:pPr>
+      <w:r>
+        <w:t>Deep Learning and Representation Learning: 12 papers, representing 1.7% of the selected set.</w:t>
+      </w:r>
+    </w:p>
+    <w:p>
+      <w:pPr>
+        <w:pStyle w:val="ListBullet"/>
+      </w:pPr>
+      <w:r>
+        <w:t>Speech, Language, and Communication BCIs: 7 papers, representing 1.0% of the selected set.</w:t>
+      </w:r>
+    </w:p>
+    <w:p>
+      <w:pPr>
+        <w:pStyle w:val="ListBullet"/>
+      </w:pPr>
+      <w:r>
+        <w:t>Hybrid, Affective, and Closed-loop BCIs: 3 papers, representing 0.4% of the selected set.</w:t>
+      </w:r>
+    </w:p>
+    <w:p>
+      <w:pPr>
+        <w:pStyle w:val="Heading1"/>
+      </w:pPr>
+      <w:r>
+        <w:t>5. Year-by-Year Trends</w:t>
       </w:r>
     </w:p>
     <w:p>
@@ -195,7 +315,255 @@
         <w:pStyle w:val="Heading1"/>
       </w:pPr>
       <w:r>
-        <w:t>4. Limitations</w:t>
+        <w:t>6. Top Papers by Importance Score</w:t>
+      </w:r>
+    </w:p>
+    <w:p>
+      <w:pPr>
+        <w:pStyle w:val="ListNumber"/>
+      </w:pPr>
+      <w:r>
+        <w:t>2024 #1: Large Brain Model for Learning Generic Representations with Tremendous EEG Data in BCI (225.212)</w:t>
+      </w:r>
+    </w:p>
+    <w:p>
+      <w:pPr>
+        <w:pStyle w:val="ListNumber"/>
+      </w:pPr>
+      <w:r>
+        <w:t>2023 #1: Physics-Informed Attention Temporal Convolutional Network for EEG-Based Motor Imagery Classification (223.501)</w:t>
+      </w:r>
+    </w:p>
+    <w:p>
+      <w:pPr>
+        <w:pStyle w:val="ListNumber"/>
+      </w:pPr>
+      <w:r>
+        <w:t>2021 #1: A brain-computer interface that evokes tactile sensations improves robotic arm control (210.4)</w:t>
+      </w:r>
+    </w:p>
+    <w:p>
+      <w:pPr>
+        <w:pStyle w:val="ListNumber"/>
+      </w:pPr>
+      <w:r>
+        <w:t>2021 #2: Deep learning techniques for classification of electroencephalogram (EEG) motor imagery (MI) signals: a review (210.037)</w:t>
+      </w:r>
+    </w:p>
+    <w:p>
+      <w:pPr>
+        <w:pStyle w:val="ListNumber"/>
+      </w:pPr>
+      <w:r>
+        <w:t>2020 #1: Current Status, Challenges, and Possible Solutions of EEG-Based Brain-Computer Interface: A Comprehensive Review (208.938)</w:t>
+      </w:r>
+    </w:p>
+    <w:p>
+      <w:pPr>
+        <w:pStyle w:val="ListNumber"/>
+      </w:pPr>
+      <w:r>
+        <w:t>2020 #2: BCI for stroke rehabilitation: motor and beyond (208.583)</w:t>
+      </w:r>
+    </w:p>
+    <w:p>
+      <w:pPr>
+        <w:pStyle w:val="ListNumber"/>
+      </w:pPr>
+      <w:r>
+        <w:t>2020 #3: Brain-Computer Interfaces (208.275)</w:t>
+      </w:r>
+    </w:p>
+    <w:p>
+      <w:pPr>
+        <w:pStyle w:val="ListNumber"/>
+      </w:pPr>
+      <w:r>
+        <w:t>2020 #4: Adaptive transfer learning for EEG motor imagery classification with deep Convolutional Neural Network (203.343)</w:t>
+      </w:r>
+    </w:p>
+    <w:p>
+      <w:pPr>
+        <w:pStyle w:val="ListNumber"/>
+      </w:pPr>
+      <w:r>
+        <w:t>2021 #3: Deep learning for motor imagery EEG-based classification: A review (202.302)</w:t>
+      </w:r>
+    </w:p>
+    <w:p>
+      <w:pPr>
+        <w:pStyle w:val="ListNumber"/>
+      </w:pPr>
+      <w:r>
+        <w:t>2021 #4: FBCNet: A Multi-view Convolutional Neural Network for Brain-Computer Interface (201.641)</w:t>
+      </w:r>
+    </w:p>
+    <w:p>
+      <w:pPr>
+        <w:pStyle w:val="ListNumber"/>
+      </w:pPr>
+      <w:r>
+        <w:t>2020 #5: Stabilization of a brain-computer interface via the alignment of low-dimensional spaces of neural activity (199.577)</w:t>
+      </w:r>
+    </w:p>
+    <w:p>
+      <w:pPr>
+        <w:pStyle w:val="ListNumber"/>
+      </w:pPr>
+      <w:r>
+        <w:t>2021 #5: Improving the Performance of Individually Calibrated SSVEP-BCI by Task- Discriminant Component Analysis (194.138)</w:t>
+      </w:r>
+    </w:p>
+    <w:p>
+      <w:pPr>
+        <w:pStyle w:val="Heading1"/>
+      </w:pPr>
+      <w:r>
+        <w:t>7. Top Papers by Citation Count</w:t>
+      </w:r>
+    </w:p>
+    <w:p>
+      <w:pPr>
+        <w:pStyle w:val="ListNumber"/>
+      </w:pPr>
+      <w:r>
+        <w:t>2021 #2: Deep learning techniques for classification of electroencephalogram (EEG) motor imagery (MI) signals: a review (551 citations)</w:t>
+      </w:r>
+    </w:p>
+    <w:p>
+      <w:pPr>
+        <w:pStyle w:val="ListNumber"/>
+      </w:pPr>
+      <w:r>
+        <w:t>2020 #3: Brain-Computer Interfaces (548 citations)</w:t>
+      </w:r>
+    </w:p>
+    <w:p>
+      <w:pPr>
+        <w:pStyle w:val="ListNumber"/>
+      </w:pPr>
+      <w:r>
+        <w:t>2021 #1: A brain-computer interface that evokes tactile sensations improves robotic arm control (503 citations)</w:t>
+      </w:r>
+    </w:p>
+    <w:p>
+      <w:pPr>
+        <w:pStyle w:val="ListNumber"/>
+      </w:pPr>
+      <w:r>
+        <w:t>2020 #1: Current Status, Challenges, and Possible Solutions of EEG-Based Brain-Computer Interface: A Comprehensive Review (420 citations)</w:t>
+      </w:r>
+    </w:p>
+    <w:p>
+      <w:pPr>
+        <w:pStyle w:val="ListNumber"/>
+      </w:pPr>
+      <w:r>
+        <w:t>2021 #3: Deep learning for motor imagery EEG-based classification: A review (408 citations)</w:t>
+      </w:r>
+    </w:p>
+    <w:p>
+      <w:pPr>
+        <w:pStyle w:val="ListNumber"/>
+      </w:pPr>
+      <w:r>
+        <w:t>2020 #2: BCI for stroke rehabilitation: motor and beyond (386 citations)</w:t>
+      </w:r>
+    </w:p>
+    <w:p>
+      <w:pPr>
+        <w:pStyle w:val="ListNumber"/>
+      </w:pPr>
+      <w:r>
+        <w:t>2023 #1: Physics-Informed Attention Temporal Convolutional Network for EEG-Based Motor Imagery Classification (370 citations)</w:t>
+      </w:r>
+    </w:p>
+    <w:p>
+      <w:pPr>
+        <w:pStyle w:val="ListNumber"/>
+      </w:pPr>
+      <w:r>
+        <w:t>2024 #1: Large Brain Model for Learning Generic Representations with Tremendous EEG Data in BCI (351 citations)</w:t>
+      </w:r>
+    </w:p>
+    <w:p>
+      <w:pPr>
+        <w:pStyle w:val="ListNumber"/>
+      </w:pPr>
+      <w:r>
+        <w:t>2020 #7: EEG-Based Brain-Computer Interfaces (BCIs): A Survey of Recent Studies on Signal Sensing Technologies and Computational Intelligence Approaches and Their Applications (322 citations)</w:t>
+      </w:r>
+    </w:p>
+    <w:p>
+      <w:pPr>
+        <w:pStyle w:val="ListNumber"/>
+      </w:pPr>
+      <w:r>
+        <w:t>2022 #8: Past, Present, and Future of EEG-Based BCI Applications (286 citations)</w:t>
+      </w:r>
+    </w:p>
+    <w:p>
+      <w:pPr>
+        <w:pStyle w:val="ListNumber"/>
+      </w:pPr>
+      <w:r>
+        <w:t>2020 #10: Intra- and Inter-subject Variability in EEG-Based Sensorimotor Brain Computer Interface: A Review (275 citations)</w:t>
+      </w:r>
+    </w:p>
+    <w:p>
+      <w:pPr>
+        <w:pStyle w:val="ListNumber"/>
+      </w:pPr>
+      <w:r>
+        <w:t>2020 #4: Adaptive transfer learning for EEG motor imagery classification with deep Convolutional Neural Network (266 citations)</w:t>
+      </w:r>
+    </w:p>
+    <w:p>
+      <w:pPr>
+        <w:pStyle w:val="Heading1"/>
+      </w:pPr>
+      <w:r>
+        <w:t>8. Future Research Agenda</w:t>
+      </w:r>
+    </w:p>
+    <w:p>
+      <w:pPr>
+        <w:pStyle w:val="ListBullet"/>
+      </w:pPr>
+      <w:r>
+        <w:t>Add PDF-level appraisal of clinical evidence and risk-of-bias indicators.</w:t>
+      </w:r>
+    </w:p>
+    <w:p>
+      <w:pPr>
+        <w:pStyle w:val="ListBullet"/>
+      </w:pPr>
+      <w:r>
+        <w:t>Normalize dataset availability, released code, participant counts, and long-term stability metrics.</w:t>
+      </w:r>
+    </w:p>
+    <w:p>
+      <w:pPr>
+        <w:pStyle w:val="ListBullet"/>
+      </w:pPr>
+      <w:r>
+        <w:t>Use expert review to compensate for low citation counts among very recent papers in the 500-candidate pools.</w:t>
+      </w:r>
+    </w:p>
+    <w:p>
+      <w:pPr>
+        <w:pStyle w:val="ListBullet"/>
+      </w:pPr>
+      <w:r>
+        <w:t>Extend the taxonomy with user-centered usability, safety, privacy, and neuroethics criteria.</w:t>
+      </w:r>
+    </w:p>
+    <w:p>
+      <w:pPr>
+        <w:pStyle w:val="Heading1"/>
+      </w:pPr>
+      <w:r>
+        <w:t>9. Limitations</w:t>
       </w:r>
     </w:p>
     <w:p>
@@ -208,7 +576,7 @@
         <w:pStyle w:val="Heading1"/>
       </w:pPr>
       <w:r>
-        <w:t>5. Conclusion</w:t>
+        <w:t>10. Conclusion</w:t>
       </w:r>
     </w:p>
     <w:p>

</xml_diff>

<commit_message>
Extend BCI curation to 2000-2026
</commit_message>
<xml_diff>
--- a/paper/review_en.docx
+++ b/paper/review_en.docx
@@ -7,12 +7,12 @@
         <w:pStyle w:val="Title"/>
       </w:pPr>
       <w:r>
-        <w:t>Brain-Computer Interface Research from 2020 to 2026: A Metadata-Driven Review</w:t>
+        <w:t>Brain-Computer Interface Research from 2000 to 2026: A Metadata-Driven Review</w:t>
       </w:r>
     </w:p>
     <w:p>
       <w:r>
-        <w:t>Generated: 2026-06-25 | Dataset: 700 papers</w:t>
+        <w:t>Generated: 2026-06-25 | Dataset: 2447 papers</w:t>
       </w:r>
     </w:p>
     <w:p>
@@ -25,7 +25,7 @@
     </w:p>
     <w:p>
       <w:r>
-        <w:t>This draft review maps Brain-Computer Interface (BCI) research from 2020 through 2026, investigating up to 500 candidate papers per year from free public Semantic Scholar metadata and selecting 100 papers per year by importance score. Candidate papers were retrieved with BCI-related queries, filtered by target year and strengthened BCI relevance terms, deduplicated, and scored for importance. The resulting collection highlights work on motor imagery and movement decoding, SSVEP/P300/ERP systems, rehabilitation and neuroprosthetics, invasive interfaces, deep learning, EEG signal processing, speech and communication BCIs, and hybrid or closed-loop systems.</w:t>
+        <w:t>This draft review maps Brain-Computer Interface (BCI) research from 2000 through 2026, investigating up to 500 candidate papers per year from free public Semantic Scholar metadata and selecting 100 papers per year by citation count. Candidate papers were retrieved with BCI-related queries, filtered by target year and strengthened BCI relevance terms, deduplicated, and scored for candidate auditing. The resulting collection highlights work on motor imagery and movement decoding, SSVEP/P300/ERP systems, rehabilitation and neuroprosthetics, invasive interfaces, deep learning, EEG signal processing, speech and communication BCIs, and hybrid or closed-loop systems.</w:t>
       </w:r>
     </w:p>
     <w:p>
@@ -38,7 +38,7 @@
     </w:p>
     <w:p>
       <w:r>
-        <w:t>Methods: For each year, BCI-oriented queries were sent to the Semantic Scholar Academic Graph bulk search endpoint. Records were retained when their title or abstract matched BCI relevance expressions, deduplicated by DOI, arXiv, PubMed, CorpusId, or paperId, and reduced to at most 500 candidate papers per year. The final 100 papers per year were selected by an importance score that combines log-scaled citations, log-scaled influential citations, recognized venue signals, BCI relevance-term density, and bonuses for reviews/surveys, datasets/benchmarks, clinical or rehabilitation relevance, invasive high-bandwidth BCIs, and modern machine-learning methods. The year 2026 should be interpreted as a partial year as of 2026-06-25.</w:t>
+        <w:t>Methods: For each year, BCI-oriented queries were sent to the Semantic Scholar Academic Graph bulk search endpoint. Records were retained when their title or abstract matched BCI relevance expressions, deduplicated by DOI, arXiv, PubMed, CorpusId, or paperId, and reduced to at most 500 candidate papers per year. The final 100 papers per year were selected by citation count, with influential citation count and the metadata importance score retained as tie-breakers and audit signals. The importance score combines log-scaled citations, log-scaled influential citations, recognized venue signals, BCI relevance-term density, and bonuses for reviews/surveys, datasets/benchmarks, clinical or rehabilitation relevance, invasive high-bandwidth BCIs, and modern machine-learning methods. The year 2026 should be interpreted as a partial year as of 2026-06-25.</w:t>
       </w:r>
     </w:p>
     <w:p>
@@ -54,7 +54,7 @@
         <w:pStyle w:val="ListBullet"/>
       </w:pPr>
       <w:r>
-        <w:t>The 700 selected papers account for 35,960 citations in the selected set, with the largest citation mass in 2020.</w:t>
+        <w:t>The 2447 selected papers account for 310,964 citations in the selected set, with the largest citation mass in 2011.</w:t>
       </w:r>
     </w:p>
     <w:p>
@@ -62,7 +62,7 @@
         <w:pStyle w:val="ListBullet"/>
       </w:pPr>
       <w:r>
-        <w:t>The dominant category is Motor Imagery and Movement Decoding (476 papers), indicating that movement intention decoding and motor assistance remain the organizing center of 2020s BCI research.</w:t>
+        <w:t>The dominant category is Motor Imagery and Movement Decoding (1050 papers), indicating that movement intention decoding and motor assistance remain the organizing center of BCI research since 2000.</w:t>
       </w:r>
     </w:p>
     <w:p>
@@ -94,7 +94,7 @@
         <w:pStyle w:val="ListBullet"/>
       </w:pPr>
       <w:r>
-        <w:t>Motor Imagery and Movement Decoding: 476</w:t>
+        <w:t>Motor Imagery and Movement Decoding: 1050</w:t>
       </w:r>
     </w:p>
     <w:p>
@@ -102,7 +102,7 @@
         <w:pStyle w:val="ListBullet"/>
       </w:pPr>
       <w:r>
-        <w:t>SSVEP, P300, and ERP Spellers: 99</w:t>
+        <w:t>General BCI Methods and Systems: 425</w:t>
       </w:r>
     </w:p>
     <w:p>
@@ -110,7 +110,7 @@
         <w:pStyle w:val="ListBullet"/>
       </w:pPr>
       <w:r>
-        <w:t>Invasive and Implantable Interfaces: 39</w:t>
+        <w:t>SSVEP, P300, and ERP Spellers: 391</w:t>
       </w:r>
     </w:p>
     <w:p>
@@ -118,7 +118,7 @@
         <w:pStyle w:val="ListBullet"/>
       </w:pPr>
       <w:r>
-        <w:t>EEG Signal Processing and Datasets: 29</w:t>
+        <w:t>EEG Signal Processing and Datasets: 265</w:t>
       </w:r>
     </w:p>
     <w:p>
@@ -126,7 +126,7 @@
         <w:pStyle w:val="ListBullet"/>
       </w:pPr>
       <w:r>
-        <w:t>Rehabilitation and Neuroprosthetics: 21</w:t>
+        <w:t>Invasive and Implantable Interfaces: 135</w:t>
       </w:r>
     </w:p>
     <w:p>
@@ -134,7 +134,7 @@
         <w:pStyle w:val="ListBullet"/>
       </w:pPr>
       <w:r>
-        <w:t>General BCI Methods and Systems: 14</w:t>
+        <w:t>Rehabilitation and Neuroprosthetics: 87</w:t>
       </w:r>
     </w:p>
     <w:p>
@@ -142,7 +142,7 @@
         <w:pStyle w:val="ListBullet"/>
       </w:pPr>
       <w:r>
-        <w:t>Deep Learning and Representation Learning: 12</w:t>
+        <w:t>Hybrid, Affective, and Closed-loop BCIs: 32</w:t>
       </w:r>
     </w:p>
     <w:p>
@@ -150,7 +150,7 @@
         <w:pStyle w:val="ListBullet"/>
       </w:pPr>
       <w:r>
-        <w:t>Speech, Language, and Communication BCIs: 7</w:t>
+        <w:t>Speech, Language, and Communication BCIs: 31</w:t>
       </w:r>
     </w:p>
     <w:p>
@@ -158,7 +158,7 @@
         <w:pStyle w:val="ListBullet"/>
       </w:pPr>
       <w:r>
-        <w:t>Hybrid, Affective, and Closed-loop BCIs: 3</w:t>
+        <w:t>Deep Learning and Representation Learning: 31</w:t>
       </w:r>
     </w:p>
     <w:p>
@@ -174,7 +174,7 @@
         <w:pStyle w:val="ListBullet"/>
       </w:pPr>
       <w:r>
-        <w:t>Motor Imagery and Movement Decoding: 476 papers, representing 68.0% of the selected set.</w:t>
+        <w:t>Motor Imagery and Movement Decoding: 1050 papers, representing 42.9% of the selected set.</w:t>
       </w:r>
     </w:p>
     <w:p>
@@ -182,7 +182,7 @@
         <w:pStyle w:val="ListBullet"/>
       </w:pPr>
       <w:r>
-        <w:t>SSVEP, P300, and ERP Spellers: 99 papers, representing 14.1% of the selected set.</w:t>
+        <w:t>General BCI Methods and Systems: 425 papers, representing 17.4% of the selected set.</w:t>
       </w:r>
     </w:p>
     <w:p>
@@ -190,7 +190,7 @@
         <w:pStyle w:val="ListBullet"/>
       </w:pPr>
       <w:r>
-        <w:t>Invasive and Implantable Interfaces: 39 papers, representing 5.6% of the selected set.</w:t>
+        <w:t>SSVEP, P300, and ERP Spellers: 391 papers, representing 16.0% of the selected set.</w:t>
       </w:r>
     </w:p>
     <w:p>
@@ -198,7 +198,7 @@
         <w:pStyle w:val="ListBullet"/>
       </w:pPr>
       <w:r>
-        <w:t>EEG Signal Processing and Datasets: 29 papers, representing 4.1% of the selected set.</w:t>
+        <w:t>EEG Signal Processing and Datasets: 265 papers, representing 10.8% of the selected set.</w:t>
       </w:r>
     </w:p>
     <w:p>
@@ -206,7 +206,7 @@
         <w:pStyle w:val="ListBullet"/>
       </w:pPr>
       <w:r>
-        <w:t>Rehabilitation and Neuroprosthetics: 21 papers, representing 3.0% of the selected set.</w:t>
+        <w:t>Invasive and Implantable Interfaces: 135 papers, representing 5.5% of the selected set.</w:t>
       </w:r>
     </w:p>
     <w:p>
@@ -214,7 +214,7 @@
         <w:pStyle w:val="ListBullet"/>
       </w:pPr>
       <w:r>
-        <w:t>General BCI Methods and Systems: 14 papers, representing 2.0% of the selected set.</w:t>
+        <w:t>Rehabilitation and Neuroprosthetics: 87 papers, representing 3.6% of the selected set.</w:t>
       </w:r>
     </w:p>
     <w:p>
@@ -222,7 +222,7 @@
         <w:pStyle w:val="ListBullet"/>
       </w:pPr>
       <w:r>
-        <w:t>Deep Learning and Representation Learning: 12 papers, representing 1.7% of the selected set.</w:t>
+        <w:t>Hybrid, Affective, and Closed-loop BCIs: 32 papers, representing 1.3% of the selected set.</w:t>
       </w:r>
     </w:p>
     <w:p>
@@ -230,7 +230,7 @@
         <w:pStyle w:val="ListBullet"/>
       </w:pPr>
       <w:r>
-        <w:t>Speech, Language, and Communication BCIs: 7 papers, representing 1.0% of the selected set.</w:t>
+        <w:t>Speech, Language, and Communication BCIs: 31 papers, representing 1.3% of the selected set.</w:t>
       </w:r>
     </w:p>
     <w:p>
@@ -238,7 +238,7 @@
         <w:pStyle w:val="ListBullet"/>
       </w:pPr>
       <w:r>
-        <w:t>Hybrid, Affective, and Closed-loop BCIs: 3 papers, representing 0.4% of the selected set.</w:t>
+        <w:t>Deep Learning and Representation Learning: 31 papers, representing 1.3% of the selected set.</w:t>
       </w:r>
     </w:p>
     <w:p>
@@ -259,7 +259,7 @@
         <w:pStyle w:val="ListBullet"/>
       </w:pPr>
       <w:r>
-        <w:t>2020: 100 papers, 10,957 citations in selected set, top paper: Current Status, Challenges, and Possible Solutions of EEG-Based Brain-Computer Interface: A Comprehensive Review</w:t>
+        <w:t>2000: 20 papers, 6,492 citations in selected set, top paper: Brain-computer interface technology: a review of the first international meeting.</w:t>
       </w:r>
     </w:p>
     <w:p>
@@ -267,7 +267,7 @@
         <w:pStyle w:val="ListBullet"/>
       </w:pPr>
       <w:r>
-        <w:t>2021: 100 papers, 8,999 citations in selected set, top paper: A brain-computer interface that evokes tactile sensations improves robotic arm control</w:t>
+        <w:t>2001: 14 papers, 3,007 citations in selected set, top paper: Motor imagery and direct brain-computer communication</w:t>
       </w:r>
     </w:p>
     <w:p>
@@ -275,7 +275,7 @@
         <w:pStyle w:val="ListBullet"/>
       </w:pPr>
       <w:r>
-        <w:t>2022: 100 papers, 6,112 citations in selected set, top paper: FBMSNet: A Filter-Bank Multi-Scale Convolutional Neural Network for EEG-Based Motor Imagery Decoding</w:t>
+        <w:t>2002: 24 papers, 7,864 citations in selected set, top paper: Brain-computer interfaces for communication and control.</w:t>
       </w:r>
     </w:p>
     <w:p>
@@ -283,7 +283,7 @@
         <w:pStyle w:val="ListBullet"/>
       </w:pPr>
       <w:r>
-        <w:t>2023: 100 papers, 4,932 citations in selected set, top paper: Physics-Informed Attention Temporal Convolutional Network for EEG-Based Motor Imagery Classification</w:t>
+        <w:t>2003: 89 papers, 7,102 citations in selected set, top paper: A BCI-based environmental controller for the motion-disabled.</w:t>
       </w:r>
     </w:p>
     <w:p>
@@ -291,7 +291,7 @@
         <w:pStyle w:val="ListBullet"/>
       </w:pPr>
       <w:r>
-        <w:t>2024: 100 papers, 3,461 citations in selected set, top paper: Large Brain Model for Learning Generic Representations with Tremendous EEG Data in BCI</w:t>
+        <w:t>2004: 100 papers, 14,605 citations in selected set, top paper: BCI2000: a general-purpose brain-computer interface (BCI) system</w:t>
       </w:r>
     </w:p>
     <w:p>
@@ -299,7 +299,7 @@
         <w:pStyle w:val="ListBullet"/>
       </w:pPr>
       <w:r>
-        <w:t>2025: 100 papers, 1,397 citations in selected set, top paper: EEG-based brain-computer interface enables real-time robotic hand control at individual finger level</w:t>
+        <w:t>2005: 100 papers, 6,627 citations in selected set, top paper: Patients with ALS can use sensorimotor rhythms to operate a brain-computer interface</w:t>
       </w:r>
     </w:p>
     <w:p>
@@ -307,175 +307,175 @@
         <w:pStyle w:val="ListBullet"/>
       </w:pPr>
       <w:r>
-        <w:t>2026: 100 papers, 102 citations in selected set, top paper: Toward Robust, Reproducible, and Widely Accessible Intracranial Language Brain-Computer Interfaces: A Comprehensive Review of Neural Mechanisms, Hardware, Algorithms, Evaluation, Clinical Pathways and Future Directions</w:t>
+        <w:t>2006: 100 papers, 17,128 citations in selected set, top paper: Brain-machine interfaces: past, present and future.</w:t>
       </w:r>
     </w:p>
     <w:p>
       <w:pPr>
-        <w:pStyle w:val="Heading1"/>
+        <w:pStyle w:val="ListBullet"/>
       </w:pPr>
       <w:r>
-        <w:t>6. Top Papers by Importance Score</w:t>
+        <w:t>2007: 100 papers, 10,574 citations in selected set, top paper: The non-invasive Berlin Brain-Computer Interface: Fast acquisition of effective performance in untrained subjects</w:t>
       </w:r>
     </w:p>
     <w:p>
       <w:pPr>
-        <w:pStyle w:val="ListNumber"/>
+        <w:pStyle w:val="ListBullet"/>
       </w:pPr>
       <w:r>
-        <w:t>2024 #1: Large Brain Model for Learning Generic Representations with Tremendous EEG Data in BCI (225.212)</w:t>
+        <w:t>2008: 100 papers, 18,705 citations in selected set, top paper: Filter Bank Common Spatial Pattern (FBCSP) in Brain-Computer Interface</w:t>
       </w:r>
     </w:p>
     <w:p>
       <w:pPr>
-        <w:pStyle w:val="ListNumber"/>
+        <w:pStyle w:val="ListBullet"/>
       </w:pPr>
       <w:r>
-        <w:t>2023 #1: Physics-Informed Attention Temporal Convolutional Network for EEG-Based Motor Imagery Classification (223.501)</w:t>
+        <w:t>2009: 100 papers, 13,728 citations in selected set, top paper: An online multi-channel SSVEP-based brain–computer interface using a canonical correlation analysis method</w:t>
       </w:r>
     </w:p>
     <w:p>
       <w:pPr>
-        <w:pStyle w:val="ListNumber"/>
+        <w:pStyle w:val="ListBullet"/>
       </w:pPr>
       <w:r>
-        <w:t>2021 #1: A brain-computer interface that evokes tactile sensations improves robotic arm control (210.4)</w:t>
+        <w:t>2010: 100 papers, 17,519 citations in selected set, top paper: The Hybrid BCI</w:t>
       </w:r>
     </w:p>
     <w:p>
       <w:pPr>
-        <w:pStyle w:val="ListNumber"/>
+        <w:pStyle w:val="ListBullet"/>
       </w:pPr>
       <w:r>
-        <w:t>2021 #2: Deep learning techniques for classification of electroencephalogram (EEG) motor imagery (MI) signals: a review (210.037)</w:t>
+        <w:t>2011: 100 papers, 20,824 citations in selected set, top paper: Brain-Computer Interfaces for Communication and Control</w:t>
       </w:r>
     </w:p>
     <w:p>
       <w:pPr>
-        <w:pStyle w:val="ListNumber"/>
+        <w:pStyle w:val="ListBullet"/>
       </w:pPr>
       <w:r>
-        <w:t>2020 #1: Current Status, Challenges, and Possible Solutions of EEG-Based Brain-Computer Interface: A Comprehensive Review (208.938)</w:t>
+        <w:t>2012: 100 papers, 15,347 citations in selected set, top paper: Filter Bank Common Spatial Pattern Algorithm on BCI Competition IV Datasets 2a and 2b</w:t>
       </w:r>
     </w:p>
     <w:p>
       <w:pPr>
-        <w:pStyle w:val="ListNumber"/>
+        <w:pStyle w:val="ListBullet"/>
       </w:pPr>
       <w:r>
-        <w:t>2020 #2: BCI for stroke rehabilitation: motor and beyond (208.583)</w:t>
+        <w:t>2013: 100 papers, 15,830 citations in selected set, top paper: Failure mode analysis of silicon-based intracortical microelectrode arrays in non-human primates</w:t>
       </w:r>
     </w:p>
     <w:p>
       <w:pPr>
-        <w:pStyle w:val="ListNumber"/>
+        <w:pStyle w:val="ListBullet"/>
       </w:pPr>
       <w:r>
-        <w:t>2020 #3: Brain-Computer Interfaces (208.275)</w:t>
+        <w:t>2014: 100 papers, 12,955 citations in selected set, top paper: Brain-Computer Interfaces Using Sensorimotor Rhythms: Current State and Future Perspectives</w:t>
       </w:r>
     </w:p>
     <w:p>
       <w:pPr>
-        <w:pStyle w:val="ListNumber"/>
+        <w:pStyle w:val="ListBullet"/>
       </w:pPr>
       <w:r>
-        <w:t>2020 #4: Adaptive transfer learning for EEG motor imagery classification with deep Convolutional Neural Network (203.343)</w:t>
+        <w:t>2015: 100 papers, 16,376 citations in selected set, top paper: fNIRS-based brain-computer interfaces: a review</w:t>
       </w:r>
     </w:p>
     <w:p>
       <w:pPr>
-        <w:pStyle w:val="ListNumber"/>
+        <w:pStyle w:val="ListBullet"/>
       </w:pPr>
       <w:r>
-        <w:t>2021 #3: Deep learning for motor imagery EEG-based classification: A review (202.302)</w:t>
+        <w:t>2016: 100 papers, 15,478 citations in selected set, top paper: EEGNet: a compact convolutional neural network for EEG-based brain–computer interfaces</w:t>
       </w:r>
     </w:p>
     <w:p>
       <w:pPr>
-        <w:pStyle w:val="ListNumber"/>
+        <w:pStyle w:val="ListBullet"/>
       </w:pPr>
       <w:r>
-        <w:t>2021 #4: FBCNet: A Multi-view Convolutional Neural Network for Brain-Computer Interface (201.641)</w:t>
+        <w:t>2017: 100 papers, 15,668 citations in selected set, top paper: A novel deep learning approach for classification of EEG motor imagery signals</w:t>
       </w:r>
     </w:p>
     <w:p>
       <w:pPr>
-        <w:pStyle w:val="ListNumber"/>
+        <w:pStyle w:val="ListBullet"/>
       </w:pPr>
       <w:r>
-        <w:t>2020 #5: Stabilization of a brain-computer interface via the alignment of low-dimensional spaces of neural activity (199.577)</w:t>
+        <w:t>2018: 100 papers, 13,140 citations in selected set, top paper: Learning Temporal Information for Brain-Computer Interface Using Convolutional Neural Networks</w:t>
       </w:r>
     </w:p>
     <w:p>
       <w:pPr>
-        <w:pStyle w:val="ListNumber"/>
+        <w:pStyle w:val="ListBullet"/>
       </w:pPr>
       <w:r>
-        <w:t>2021 #5: Improving the Performance of Individually Calibrated SSVEP-BCI by Task- Discriminant Component Analysis (194.138)</w:t>
+        <w:t>2019: 100 papers, 16,909 citations in selected set, top paper: Deep learning for electroencephalogram (EEG) classification tasks: a review</w:t>
       </w:r>
     </w:p>
     <w:p>
       <w:pPr>
-        <w:pStyle w:val="Heading1"/>
+        <w:pStyle w:val="ListBullet"/>
       </w:pPr>
       <w:r>
-        <w:t>7. Top Papers by Citation Count</w:t>
+        <w:t>2020: 100 papers, 13,125 citations in selected set, top paper: Brain-Computer Interfaces</w:t>
       </w:r>
     </w:p>
     <w:p>
       <w:pPr>
-        <w:pStyle w:val="ListNumber"/>
+        <w:pStyle w:val="ListBullet"/>
       </w:pPr>
       <w:r>
-        <w:t>2021 #2: Deep learning techniques for classification of electroencephalogram (EEG) motor imagery (MI) signals: a review (551 citations)</w:t>
+        <w:t>2021: 100 papers, 11,412 citations in selected set, top paper: High-performance brain-to-text communication via handwriting</w:t>
       </w:r>
     </w:p>
     <w:p>
       <w:pPr>
-        <w:pStyle w:val="ListNumber"/>
+        <w:pStyle w:val="ListBullet"/>
       </w:pPr>
       <w:r>
-        <w:t>2020 #3: Brain-Computer Interfaces (548 citations)</w:t>
+        <w:t>2022: 100 papers, 7,455 citations in selected set, top paper: Past, Present, and Future of EEG-Based BCI Applications</w:t>
       </w:r>
     </w:p>
     <w:p>
       <w:pPr>
-        <w:pStyle w:val="ListNumber"/>
+        <w:pStyle w:val="ListBullet"/>
       </w:pPr>
       <w:r>
-        <w:t>2021 #1: A brain-computer interface that evokes tactile sensations improves robotic arm control (503 citations)</w:t>
+        <w:t>2023: 100 papers, 6,906 citations in selected set, top paper: Physics-Informed Attention Temporal Convolutional Network for EEG-Based Motor Imagery Classification</w:t>
       </w:r>
     </w:p>
     <w:p>
       <w:pPr>
-        <w:pStyle w:val="ListNumber"/>
+        <w:pStyle w:val="ListBullet"/>
       </w:pPr>
       <w:r>
-        <w:t>2020 #1: Current Status, Challenges, and Possible Solutions of EEG-Based Brain-Computer Interface: A Comprehensive Review (420 citations)</w:t>
+        <w:t>2024: 100 papers, 4,231 citations in selected set, top paper: Large Brain Model for Learning Generic Representations with Tremendous EEG Data in BCI</w:t>
       </w:r>
     </w:p>
     <w:p>
       <w:pPr>
-        <w:pStyle w:val="ListNumber"/>
+        <w:pStyle w:val="ListBullet"/>
       </w:pPr>
       <w:r>
-        <w:t>2021 #3: Deep learning for motor imagery EEG-based classification: A review (408 citations)</w:t>
+        <w:t>2025: 100 papers, 1,787 citations in selected set, top paper: Recent applications of EEG-based brain-computer-interface in the medical field</w:t>
       </w:r>
     </w:p>
     <w:p>
       <w:pPr>
-        <w:pStyle w:val="ListNumber"/>
+        <w:pStyle w:val="ListBullet"/>
       </w:pPr>
       <w:r>
-        <w:t>2020 #2: BCI for stroke rehabilitation: motor and beyond (386 citations)</w:t>
+        <w:t>2026: 100 papers, 170 citations in selected set, top paper: EEG Foundation Models: Progresses, Benchmarking, and Open Problems</w:t>
       </w:r>
     </w:p>
     <w:p>
       <w:pPr>
-        <w:pStyle w:val="ListNumber"/>
+        <w:pStyle w:val="Heading1"/>
       </w:pPr>
       <w:r>
-        <w:t>2023 #1: Physics-Informed Attention Temporal Convolutional Network for EEG-Based Motor Imagery Classification (370 citations)</w:t>
+        <w:t>6. Top Papers by Citation Count</w:t>
       </w:r>
     </w:p>
     <w:p>
@@ -483,7 +483,7 @@
         <w:pStyle w:val="ListNumber"/>
       </w:pPr>
       <w:r>
-        <w:t>2024 #1: Large Brain Model for Learning Generic Representations with Tremendous EEG Data in BCI (351 citations)</w:t>
+        <w:t>2002 #1: Brain-computer interfaces for communication and control. (5454 citations)</w:t>
       </w:r>
     </w:p>
     <w:p>
@@ -491,7 +491,7 @@
         <w:pStyle w:val="ListNumber"/>
       </w:pPr>
       <w:r>
-        <w:t>2020 #7: EEG-Based Brain-Computer Interfaces (BCIs): A Survey of Recent Studies on Signal Sensing Technologies and Computational Intelligence Approaches and Their Applications (322 citations)</w:t>
+        <w:t>2016 #1: EEGNet: a compact convolutional neural network for EEG-based brain–computer interfaces (4344 citations)</w:t>
       </w:r>
     </w:p>
     <w:p>
@@ -499,7 +499,7 @@
         <w:pStyle w:val="ListNumber"/>
       </w:pPr>
       <w:r>
-        <w:t>2022 #8: Past, Present, and Future of EEG-Based BCI Applications (286 citations)</w:t>
+        <w:t>2004 #1: BCI2000: a general-purpose brain-computer interface (BCI) system (3136 citations)</w:t>
       </w:r>
     </w:p>
     <w:p>
@@ -507,7 +507,7 @@
         <w:pStyle w:val="ListNumber"/>
       </w:pPr>
       <w:r>
-        <w:t>2020 #10: Intra- and Inter-subject Variability in EEG-Based Sensorimotor Brain Computer Interface: A Review (275 citations)</w:t>
+        <w:t>2011 #1: Brain-Computer Interfaces for Communication and Control (2866 citations)</w:t>
       </w:r>
     </w:p>
     <w:p>
@@ -515,7 +515,167 @@
         <w:pStyle w:val="ListNumber"/>
       </w:pPr>
       <w:r>
-        <w:t>2020 #4: Adaptive transfer learning for EEG motor imagery classification with deep Convolutional Neural Network (266 citations)</w:t>
+        <w:t>2000 #1: Brain-computer interface technology: a review of the first international meeting. (2282 citations)</w:t>
+      </w:r>
+    </w:p>
+    <w:p>
+      <w:pPr>
+        <w:pStyle w:val="ListNumber"/>
+      </w:pPr>
+      <w:r>
+        <w:t>2001 #1: Motor imagery and direct brain-computer communication (2002 citations)</w:t>
+      </w:r>
+    </w:p>
+    <w:p>
+      <w:pPr>
+        <w:pStyle w:val="ListNumber"/>
+      </w:pPr>
+      <w:r>
+        <w:t>2006 #1: Brain-machine interfaces: past, present and future. (1865 citations)</w:t>
+      </w:r>
+    </w:p>
+    <w:p>
+      <w:pPr>
+        <w:pStyle w:val="ListNumber"/>
+      </w:pPr>
+      <w:r>
+        <w:t>2006 #2: Mu rhythm (de)synchronization and EEG single-trial classification of different motor imagery tasks (1617 citations)</w:t>
+      </w:r>
+    </w:p>
+    <w:p>
+      <w:pPr>
+        <w:pStyle w:val="ListNumber"/>
+      </w:pPr>
+      <w:r>
+        <w:t>2004 #2: Control of a two-dimensional movement signal by a noninvasive brain-computer interface in humans. (1608 citations)</w:t>
+      </w:r>
+    </w:p>
+    <w:p>
+      <w:pPr>
+        <w:pStyle w:val="ListNumber"/>
+      </w:pPr>
+      <w:r>
+        <w:t>2019 #1: Deep learning for electroencephalogram (EEG) classification tasks: a review (1540 citations)</w:t>
+      </w:r>
+    </w:p>
+    <w:p>
+      <w:pPr>
+        <w:pStyle w:val="ListNumber"/>
+      </w:pPr>
+      <w:r>
+        <w:t>2008 #1: Filter Bank Common Spatial Pattern (FBCSP) in Brain-Computer Interface (1456 citations)</w:t>
+      </w:r>
+    </w:p>
+    <w:p>
+      <w:pPr>
+        <w:pStyle w:val="ListNumber"/>
+      </w:pPr>
+      <w:r>
+        <w:t>2000 #2: The mental prosthesis: assessing the speed of a P300-based brain-computer interface. (1299 citations)</w:t>
+      </w:r>
+    </w:p>
+    <w:p>
+      <w:pPr>
+        <w:pStyle w:val="Heading1"/>
+      </w:pPr>
+      <w:r>
+        <w:t>7. Top Papers by Metadata Importance Score (Audit Signal)</w:t>
+      </w:r>
+    </w:p>
+    <w:p>
+      <w:pPr>
+        <w:pStyle w:val="ListNumber"/>
+      </w:pPr>
+      <w:r>
+        <w:t>2016 #1: EEGNet: a compact convolutional neural network for EEG-based brain–computer interfaces (312.352)</w:t>
+      </w:r>
+    </w:p>
+    <w:p>
+      <w:pPr>
+        <w:pStyle w:val="ListNumber"/>
+      </w:pPr>
+      <w:r>
+        <w:t>2002 #1: Brain-computer interfaces for communication and control. (298.069)</w:t>
+      </w:r>
+    </w:p>
+    <w:p>
+      <w:pPr>
+        <w:pStyle w:val="ListNumber"/>
+      </w:pPr>
+      <w:r>
+        <w:t>2004 #1: BCI2000: a general-purpose brain-computer interface (BCI) system (296.159)</w:t>
+      </w:r>
+    </w:p>
+    <w:p>
+      <w:pPr>
+        <w:pStyle w:val="ListNumber"/>
+      </w:pPr>
+      <w:r>
+        <w:t>2000 #1: Brain-computer interface technology: a review of the first international meeting. (274.161)</w:t>
+      </w:r>
+    </w:p>
+    <w:p>
+      <w:pPr>
+        <w:pStyle w:val="ListNumber"/>
+      </w:pPr>
+      <w:r>
+        <w:t>2012 #1: Filter Bank Common Spatial Pattern Algorithm on BCI Competition IV Datasets 2a and 2b (269.531)</w:t>
+      </w:r>
+    </w:p>
+    <w:p>
+      <w:pPr>
+        <w:pStyle w:val="ListNumber"/>
+      </w:pPr>
+      <w:r>
+        <w:t>2011 #2: Regularizing Common Spatial Patterns to Improve BCI Designs: Unified Theory and New Algorithms (266.008)</w:t>
+      </w:r>
+    </w:p>
+    <w:p>
+      <w:pPr>
+        <w:pStyle w:val="ListNumber"/>
+      </w:pPr>
+      <w:r>
+        <w:t>2011 #1: Brain-Computer Interfaces for Communication and Control (264.735)</w:t>
+      </w:r>
+    </w:p>
+    <w:p>
+      <w:pPr>
+        <w:pStyle w:val="ListNumber"/>
+      </w:pPr>
+      <w:r>
+        <w:t>2004 #2: Control of a two-dimensional movement signal by a noninvasive brain-computer interface in humans. (262.343)</w:t>
+      </w:r>
+    </w:p>
+    <w:p>
+      <w:pPr>
+        <w:pStyle w:val="ListNumber"/>
+      </w:pPr>
+      <w:r>
+        <w:t>2019 #1: Deep learning for electroencephalogram (EEG) classification tasks: a review (260.773)</w:t>
+      </w:r>
+    </w:p>
+    <w:p>
+      <w:pPr>
+        <w:pStyle w:val="ListNumber"/>
+      </w:pPr>
+      <w:r>
+        <w:t>2008 #1: Filter Bank Common Spatial Pattern (FBCSP) in Brain-Computer Interface (260.477)</w:t>
+      </w:r>
+    </w:p>
+    <w:p>
+      <w:pPr>
+        <w:pStyle w:val="ListNumber"/>
+      </w:pPr>
+      <w:r>
+        <w:t>2006 #1: Brain-machine interfaces: past, present and future. (257.667)</w:t>
+      </w:r>
+    </w:p>
+    <w:p>
+      <w:pPr>
+        <w:pStyle w:val="ListNumber"/>
+      </w:pPr>
+      <w:r>
+        <w:t>2001 #1: Motor imagery and direct brain-computer communication (257.162)</w:t>
       </w:r>
     </w:p>
     <w:p>
@@ -581,7 +741,7 @@
     </w:p>
     <w:p>
       <w:r>
-        <w:t>Overall, BCI research in the 2020s is expanding across deep-learning EEG decoding, benchmarks and datasets, rehabilitation, high-performance invasive decoding, and usable communication systems. A full manuscript should next add PDF-level appraisal, clinical translation evidence, dataset reproducibility, long-term stability, safety, and ethics.</w:t>
+        <w:t>Overall, BCI research since 2000 is expanding across deep-learning EEG decoding, benchmarks and datasets, rehabilitation, high-performance invasive decoding, and usable communication systems. A full manuscript should next add PDF-level appraisal, clinical translation evidence, dataset reproducibility, long-term stability, safety, and ethics.</w:t>
       </w:r>
     </w:p>
     <w:p>
@@ -597,7 +757,7 @@
         <w:pStyle w:val="ListNumber"/>
       </w:pPr>
       <w:r>
-        <w:t>M. Rashid, N. Sulaiman, A. P. Majeed, R. Musa, A. Nasir, Bifta Sama Bari, et al.. (2020). Current Status, Challenges, and Possible Solutions of EEG-Based Brain-Computer Interface: A Comprehensive Review. Frontiers in Neurorobotics. https://doi.org/10.3389/fnbot.2020.00025</w:t>
+        <w:t>J. Wolpaw, N. Birbaumer, W. J. Heetderks, Dennis J. McFarland, P. Peckham, G. Schalk, et al.. (2000). Brain-computer interface technology: a review of the first international meeting.. IEEE transactions on rehabilitation engineering. https://doi.org/10.1109/TRE.2000.847807</w:t>
       </w:r>
     </w:p>
     <w:p>
@@ -605,7 +765,7 @@
         <w:pStyle w:val="ListNumber"/>
       </w:pPr>
       <w:r>
-        <w:t>Sharlene N. Flesher, J. Downey, Jeffrey M. Weiss, Christopher L. Hughes, Angelica J. Herrera, E. Tyler-Kabara, et al.. (2021). A brain-computer interface that evokes tactile sensations improves robotic arm control. Science. https://doi.org/10.1126/science.abd0380</w:t>
+        <w:t>G. Pfurtscheller, C. Neuper. (2001). Motor imagery and direct brain-computer communication. Proceedings of the IEEE. https://doi.org/10.1109/5.939829</w:t>
       </w:r>
     </w:p>
     <w:p>
@@ -613,7 +773,167 @@
         <w:pStyle w:val="ListNumber"/>
       </w:pPr>
       <w:r>
-        <w:t>Ke Liu, Mingzhao Yang, Zhuliang Yu, Guoyin Wang, Wei Wu. (2022). FBMSNet: A Filter-Bank Multi-Scale Convolutional Neural Network for EEG-Based Motor Imagery Decoding. IEEE Transactions on Biomedical Engineering. https://doi.org/10.1109/TBME.2022.3193277</w:t>
+        <w:t>J. Wolpaw, N. Birbaumer, D. McFarland, Gert Pfurtscheller, T. Vaughan. (2002). Brain-computer interfaces for communication and control.. Clinical Neurophysiology. https://doi.org/10.1016/S1388-2457(02)00057-3</w:t>
+      </w:r>
+    </w:p>
+    <w:p>
+      <w:pPr>
+        <w:pStyle w:val="ListNumber"/>
+      </w:pPr>
+      <w:r>
+        <w:t>Xiaorong Gao, D. Xu, Ming Cheng, Shangkai Gao. (2003). A BCI-based environmental controller for the motion-disabled.. IEEE transactions on neural systems and rehabilitation engineering. https://doi.org/10.1109/TNSRE.2003.814449</w:t>
+      </w:r>
+    </w:p>
+    <w:p>
+      <w:pPr>
+        <w:pStyle w:val="ListNumber"/>
+      </w:pPr>
+      <w:r>
+        <w:t>G. Schalk, D. McFarland, T. Hinterberger, N. Birbaumer, J. Wolpaw. (2004). BCI2000: a general-purpose brain-computer interface (BCI) system. IEEE Transactions on Biomedical Engineering. https://doi.org/10.1109/TBME.2004.827072</w:t>
+      </w:r>
+    </w:p>
+    <w:p>
+      <w:pPr>
+        <w:pStyle w:val="ListNumber"/>
+      </w:pPr>
+      <w:r>
+        <w:t>A. Kübler, F. Nijboer, J. Mellinger, T. M. Vaughan, H. Pawelzik, G. Schalk, et al.. (2005). Patients with ALS can use sensorimotor rhythms to operate a brain-computer interface. Neurology. https://doi.org/10.1212/01.WNL.0000158616.43002.6D</w:t>
+      </w:r>
+    </w:p>
+    <w:p>
+      <w:pPr>
+        <w:pStyle w:val="ListNumber"/>
+      </w:pPr>
+      <w:r>
+        <w:t>M. Lebedev, M. Nicolelis. (2006). Brain-machine interfaces: past, present and future.. Trends in Neurosciences. https://doi.org/10.1016/J.TINS.2006.07.004</w:t>
+      </w:r>
+    </w:p>
+    <w:p>
+      <w:pPr>
+        <w:pStyle w:val="ListNumber"/>
+      </w:pPr>
+      <w:r>
+        <w:t>B. Blankertz, G. Dornhege, M. Krauledat, K. Müller, G. Curio. (2007). The non-invasive Berlin Brain-Computer Interface: Fast acquisition of effective performance in untrained subjects. NeuroImage. https://doi.org/10.1016/J.NEUROIMAGE.2007.01.051</w:t>
+      </w:r>
+    </w:p>
+    <w:p>
+      <w:pPr>
+        <w:pStyle w:val="ListNumber"/>
+      </w:pPr>
+      <w:r>
+        <w:t>K. Ang, Z. Y. Chin, Haihong Zhang, Cuntai Guan. (2008). Filter Bank Common Spatial Pattern (FBCSP) in Brain-Computer Interface. IEEE World Congress on Computational Intelligence. https://doi.org/10.1109/IJCNN.2008.4634130</w:t>
+      </w:r>
+    </w:p>
+    <w:p>
+      <w:pPr>
+        <w:pStyle w:val="ListNumber"/>
+      </w:pPr>
+      <w:r>
+        <w:t>Guangyu Bin, Xiaorong Gao, Zheng Yan, Bo Hong, Shangkai Gao. (2009). An online multi-channel SSVEP-based brain–computer interface using a canonical correlation analysis method. Journal of Neural Engineering. https://doi.org/10.1088/1741-2560/6/4/046002</w:t>
+      </w:r>
+    </w:p>
+    <w:p>
+      <w:pPr>
+        <w:pStyle w:val="ListNumber"/>
+      </w:pPr>
+      <w:r>
+        <w:t>G. Pfurtscheller, B. Allison, C. Brunner, G. Bauernfeind, T. Solis-Escalante, Reinhold Scherer, et al.. (2010). The Hybrid BCI. Frontiers in Neuroscience. https://doi.org/10.3389/fnpro.2010.00003</w:t>
+      </w:r>
+    </w:p>
+    <w:p>
+      <w:pPr>
+        <w:pStyle w:val="ListNumber"/>
+      </w:pPr>
+      <w:r>
+        <w:t>D. McFarland, J. Wolpaw. (2011). Brain-Computer Interfaces for Communication and Control. Communications of the ACM. https://doi.org/10.1145/1941487.1941506</w:t>
+      </w:r>
+    </w:p>
+    <w:p>
+      <w:pPr>
+        <w:pStyle w:val="ListNumber"/>
+      </w:pPr>
+      <w:r>
+        <w:t>K. Ang, Z. Chin, C. Wang, Cuntai Guan, Haihong Zhang. (2012). Filter Bank Common Spatial Pattern Algorithm on BCI Competition IV Datasets 2a and 2b. Frontiers in Neuroscience. https://doi.org/10.3389/fnins.2012.00039</w:t>
+      </w:r>
+    </w:p>
+    <w:p>
+      <w:pPr>
+        <w:pStyle w:val="ListNumber"/>
+      </w:pPr>
+      <w:r>
+        <w:t>James C. Barrese, Naveen G. Rao, Kaivon Paroo, C. Triebwasser, C. Vargas-Irwin, Lachlan Franquemont, et al.. (2013). Failure mode analysis of silicon-based intracortical microelectrode arrays in non-human primates. Journal of Neural Engineering. https://doi.org/10.1088/1741-2560/10/6/066014</w:t>
+      </w:r>
+    </w:p>
+    <w:p>
+      <w:pPr>
+        <w:pStyle w:val="ListNumber"/>
+      </w:pPr>
+      <w:r>
+        <w:t>Han Yuan, B. He. (2014). Brain-Computer Interfaces Using Sensorimotor Rhythms: Current State and Future Perspectives. IEEE Transactions on Biomedical Engineering. https://doi.org/10.1109/TBME.2014.2312397</w:t>
+      </w:r>
+    </w:p>
+    <w:p>
+      <w:pPr>
+        <w:pStyle w:val="ListNumber"/>
+      </w:pPr>
+      <w:r>
+        <w:t>Noman Naseer, K. Hong. (2015). fNIRS-based brain-computer interfaces: a review. Frontiers in Human Neuroscience. https://doi.org/10.3389/fnhum.2015.00003</w:t>
+      </w:r>
+    </w:p>
+    <w:p>
+      <w:pPr>
+        <w:pStyle w:val="ListNumber"/>
+      </w:pPr>
+      <w:r>
+        <w:t>Vernon J. Lawhern, Amelia J. Solon, Nicholas R. Waytowich, S. Gordon, C. Hung, Brent Lance. (2016). EEGNet: a compact convolutional neural network for EEG-based brain–computer interfaces. Journal of Neural Engineering. https://doi.org/10.1088/1741-2552/aace8c</w:t>
+      </w:r>
+    </w:p>
+    <w:p>
+      <w:pPr>
+        <w:pStyle w:val="ListNumber"/>
+      </w:pPr>
+      <w:r>
+        <w:t>Y. R. Tabar, U. Halici. (2017). A novel deep learning approach for classification of EEG motor imagery signals. Journal of Neural Engineering. https://doi.org/10.1088/1741-2560/14/1/016003</w:t>
+      </w:r>
+    </w:p>
+    <w:p>
+      <w:pPr>
+        <w:pStyle w:val="ListNumber"/>
+      </w:pPr>
+      <w:r>
+        <w:t>Siavash Sakhavi, Cuntai Guan, Shuicheng Yan. (2018). Learning Temporal Information for Brain-Computer Interface Using Convolutional Neural Networks. IEEE Transactions on Neural Networks and Learning Systems. https://doi.org/10.1109/TNNLS.2018.2789927</w:t>
+      </w:r>
+    </w:p>
+    <w:p>
+      <w:pPr>
+        <w:pStyle w:val="ListNumber"/>
+      </w:pPr>
+      <w:r>
+        <w:t>Alexander Craik, Yongtian He, J. Contreras-Vidal. (2019). Deep learning for electroencephalogram (EEG) classification tasks: a review. Journal of Neural Engineering. https://doi.org/10.1088/1741-2552/ab0ab5</w:t>
+      </w:r>
+    </w:p>
+    <w:p>
+      <w:pPr>
+        <w:pStyle w:val="ListNumber"/>
+      </w:pPr>
+      <w:r>
+        <w:t>Ricardo Chavarriaga, J. Millán. (2020). Brain-Computer Interfaces. Handbook of Clinical Neurology. https://doi.org/10.1007/978-3-540-29678-2_717</w:t>
+      </w:r>
+    </w:p>
+    <w:p>
+      <w:pPr>
+        <w:pStyle w:val="ListNumber"/>
+      </w:pPr>
+      <w:r>
+        <w:t>Francis R. Willett, Donald T. Avansino, L. Hochberg, J. Henderson, K. Shenoy. (2021). High-performance brain-to-text communication via handwriting. Nature. https://doi.org/10.1038/s41586-021-03506-2</w:t>
+      </w:r>
+    </w:p>
+    <w:p>
+      <w:pPr>
+        <w:pStyle w:val="ListNumber"/>
+      </w:pPr>
+      <w:r>
+        <w:t>Kaido Värbu, M. Naveed, Yar Muhammad. (2022). Past, Present, and Future of EEG-Based BCI Applications. Italian National Conference on Sensors. https://doi.org/10.3390/s22093331</w:t>
       </w:r>
     </w:p>
     <w:p>
@@ -637,7 +957,7 @@
         <w:pStyle w:val="ListNumber"/>
       </w:pPr>
       <w:r>
-        <w:t>Yidan Ding, Chalisa Udompanyawit, Yisha Zhang, B. He. (2025). EEG-based brain-computer interface enables real-time robotic hand control at individual finger level. Nature Communications. https://doi.org/10.1038/s41467-025-61064-x</w:t>
+        <w:t>Xiuyun Liu, Wen-long Wang, Miao Liu, Mingyi Chen, Tânia Pereira, Desta Yakob Doda, et al.. (2025). Recent applications of EEG-based brain-computer-interface in the medical field. Military Medical Research. https://doi.org/10.1186/s40779-025-00598-z</w:t>
       </w:r>
     </w:p>
     <w:p>
@@ -645,7 +965,7 @@
         <w:pStyle w:val="ListNumber"/>
       </w:pPr>
       <w:r>
-        <w:t>Dongyi He, W. Siok, Nizhuan Wang. (2026). Toward Robust, Reproducible, and Widely Accessible Intracranial Language Brain-Computer Interfaces: A Comprehensive Review of Neural Mechanisms, Hardware, Algorithms, Evaluation, Clinical Pathways and Future Directions. Unknown venue. https://arxiv.org/abs/2603.12279</w:t>
+        <w:t>Dingkun Liu, Yuheng Chen, Zhu Chen, Zhenyao Cui, Yaozhi Wen, Jiayu An, et al.. (2026). EEG Foundation Models: Progresses, Benchmarking, and Open Problems. arXiv.org. https://doi.org/10.48550/arXiv.2601.17883</w:t>
       </w:r>
     </w:p>
     <w:sectPr>

</xml_diff>

<commit_message>
Regenerate with github-awesome-skill2 provenance
</commit_message>
<xml_diff>
--- a/paper/review_en.docx
+++ b/paper/review_en.docx
@@ -12,7 +12,7 @@
     </w:p>
     <w:p>
       <w:r>
-        <w:t>Generated: 2026-06-25 | Dataset: 2447 papers</w:t>
+        <w:t>Generated: 2026-06-26 | Dataset: 2447 papers</w:t>
       </w:r>
     </w:p>
     <w:p>
@@ -38,7 +38,7 @@
     </w:p>
     <w:p>
       <w:r>
-        <w:t>Methods: For each year, BCI-oriented queries were sent to the Semantic Scholar Academic Graph bulk search endpoint. Records were retained when their title or abstract matched BCI relevance expressions, deduplicated by DOI, arXiv, PubMed, CorpusId, or paperId, and reduced to at most 500 candidate papers per year. The final 100 papers per year were selected by citation count, with influential citation count and the metadata importance score retained as tie-breakers and audit signals. The importance score combines log-scaled citations, log-scaled influential citations, recognized venue signals, BCI relevance-term density, and bonuses for reviews/surveys, datasets/benchmarks, clinical or rehabilitation relevance, invasive high-bandwidth BCIs, and modern machine-learning methods. The year 2026 should be interpreted as a partial year as of 2026-06-25.</w:t>
+        <w:t>Methods: For each year, BCI-oriented queries were sent to the Semantic Scholar Academic Graph bulk search endpoint. Records were retained when their title or abstract matched BCI relevance expressions, deduplicated by DOI, arXiv, PubMed, CorpusId, or paperId, and reduced to at most 500 candidate papers per year. The final 100 papers per year were selected by citation count, with influential citation count and the metadata importance score retained as tie-breakers and audit signals. The importance score combines log-scaled citations, log-scaled influential citations, recognized venue signals, BCI relevance-term density, and bonuses for reviews/surveys, datasets/benchmarks, clinical or rehabilitation relevance, invasive high-bandwidth BCIs, and modern machine-learning methods. The year 2026 should be interpreted as a partial year as of 2026-06-26.</w:t>
       </w:r>
     </w:p>
     <w:p>
@@ -757,7 +757,7 @@
         <w:pStyle w:val="ListNumber"/>
       </w:pPr>
       <w:r>
-        <w:t>J. Wolpaw, N. Birbaumer, W. J. Heetderks, Dennis J. McFarland, P. Peckham, G. Schalk, et al.. (2000). Brain-computer interface technology: a review of the first international meeting.. IEEE transactions on rehabilitation engineering. https://doi.org/10.1109/TRE.2000.847807</w:t>
+        <w:t>J. Wolpaw, N. Birbaumer, W. J. Heetderks, Dennis J. McFarland, P. Peckham, G. Schalk, et al.. (2000). Brain-computer interface technology: a review of the first international meeting.. IEEE transactions on rehabilitation engineering. https://doi.org/10.1109/tre.2000.847807</w:t>
       </w:r>
     </w:p>
     <w:p>
@@ -773,7 +773,7 @@
         <w:pStyle w:val="ListNumber"/>
       </w:pPr>
       <w:r>
-        <w:t>J. Wolpaw, N. Birbaumer, D. McFarland, Gert Pfurtscheller, T. Vaughan. (2002). Brain-computer interfaces for communication and control.. Clinical Neurophysiology. https://doi.org/10.1016/S1388-2457(02)00057-3</w:t>
+        <w:t>J. Wolpaw, N. Birbaumer, D. McFarland, Gert Pfurtscheller, T. Vaughan. (2002). Brain-computer interfaces for communication and control.. Clinical Neurophysiology. https://doi.org/10.1016/s1388-2457(02)00057-3</w:t>
       </w:r>
     </w:p>
     <w:p>
@@ -781,7 +781,7 @@
         <w:pStyle w:val="ListNumber"/>
       </w:pPr>
       <w:r>
-        <w:t>Xiaorong Gao, D. Xu, Ming Cheng, Shangkai Gao. (2003). A BCI-based environmental controller for the motion-disabled.. IEEE transactions on neural systems and rehabilitation engineering. https://doi.org/10.1109/TNSRE.2003.814449</w:t>
+        <w:t>Xiaorong Gao, D. Xu, Ming Cheng, Shangkai Gao. (2003). A BCI-based environmental controller for the motion-disabled.. IEEE transactions on neural systems and rehabilitation engineering. https://doi.org/10.1109/tnsre.2003.814449</w:t>
       </w:r>
     </w:p>
     <w:p>
@@ -789,7 +789,7 @@
         <w:pStyle w:val="ListNumber"/>
       </w:pPr>
       <w:r>
-        <w:t>G. Schalk, D. McFarland, T. Hinterberger, N. Birbaumer, J. Wolpaw. (2004). BCI2000: a general-purpose brain-computer interface (BCI) system. IEEE Transactions on Biomedical Engineering. https://doi.org/10.1109/TBME.2004.827072</w:t>
+        <w:t>G. Schalk, D. McFarland, T. Hinterberger, N. Birbaumer, J. Wolpaw. (2004). BCI2000: a general-purpose brain-computer interface (BCI) system. IEEE Transactions on Biomedical Engineering. https://doi.org/10.1109/tbme.2004.827072</w:t>
       </w:r>
     </w:p>
     <w:p>
@@ -797,7 +797,7 @@
         <w:pStyle w:val="ListNumber"/>
       </w:pPr>
       <w:r>
-        <w:t>A. Kübler, F. Nijboer, J. Mellinger, T. M. Vaughan, H. Pawelzik, G. Schalk, et al.. (2005). Patients with ALS can use sensorimotor rhythms to operate a brain-computer interface. Neurology. https://doi.org/10.1212/01.WNL.0000158616.43002.6D</w:t>
+        <w:t>A. Kübler, F. Nijboer, J. Mellinger, T. M. Vaughan, H. Pawelzik, G. Schalk, et al.. (2005). Patients with ALS can use sensorimotor rhythms to operate a brain-computer interface. Neurology. https://doi.org/10.1212/01.wnl.0000158616.43002.6d</w:t>
       </w:r>
     </w:p>
     <w:p>
@@ -805,7 +805,7 @@
         <w:pStyle w:val="ListNumber"/>
       </w:pPr>
       <w:r>
-        <w:t>M. Lebedev, M. Nicolelis. (2006). Brain-machine interfaces: past, present and future.. Trends in Neurosciences. https://doi.org/10.1016/J.TINS.2006.07.004</w:t>
+        <w:t>M. Lebedev, M. Nicolelis. (2006). Brain-machine interfaces: past, present and future.. Trends in Neurosciences. https://doi.org/10.1016/j.tins.2006.07.004</w:t>
       </w:r>
     </w:p>
     <w:p>
@@ -813,7 +813,7 @@
         <w:pStyle w:val="ListNumber"/>
       </w:pPr>
       <w:r>
-        <w:t>B. Blankertz, G. Dornhege, M. Krauledat, K. Müller, G. Curio. (2007). The non-invasive Berlin Brain-Computer Interface: Fast acquisition of effective performance in untrained subjects. NeuroImage. https://doi.org/10.1016/J.NEUROIMAGE.2007.01.051</w:t>
+        <w:t>B. Blankertz, G. Dornhege, M. Krauledat, K. Müller, G. Curio. (2007). The non-invasive Berlin Brain-Computer Interface: Fast acquisition of effective performance in untrained subjects. NeuroImage. https://doi.org/10.1016/j.neuroimage.2007.01.051</w:t>
       </w:r>
     </w:p>
     <w:p>
@@ -821,7 +821,7 @@
         <w:pStyle w:val="ListNumber"/>
       </w:pPr>
       <w:r>
-        <w:t>K. Ang, Z. Y. Chin, Haihong Zhang, Cuntai Guan. (2008). Filter Bank Common Spatial Pattern (FBCSP) in Brain-Computer Interface. IEEE World Congress on Computational Intelligence. https://doi.org/10.1109/IJCNN.2008.4634130</w:t>
+        <w:t>K. Ang, Z. Y. Chin, Haihong Zhang, Cuntai Guan. (2008). Filter Bank Common Spatial Pattern (FBCSP) in Brain-Computer Interface. IEEE World Congress on Computational Intelligence. https://doi.org/10.1109/ijcnn.2008.4634130</w:t>
       </w:r>
     </w:p>
     <w:p>
@@ -869,7 +869,7 @@
         <w:pStyle w:val="ListNumber"/>
       </w:pPr>
       <w:r>
-        <w:t>Han Yuan, B. He. (2014). Brain-Computer Interfaces Using Sensorimotor Rhythms: Current State and Future Perspectives. IEEE Transactions on Biomedical Engineering. https://doi.org/10.1109/TBME.2014.2312397</w:t>
+        <w:t>Han Yuan, B. He. (2014). Brain-Computer Interfaces Using Sensorimotor Rhythms: Current State and Future Perspectives. IEEE Transactions on Biomedical Engineering. https://doi.org/10.1109/tbme.2014.2312397</w:t>
       </w:r>
     </w:p>
     <w:p>
@@ -901,7 +901,7 @@
         <w:pStyle w:val="ListNumber"/>
       </w:pPr>
       <w:r>
-        <w:t>Siavash Sakhavi, Cuntai Guan, Shuicheng Yan. (2018). Learning Temporal Information for Brain-Computer Interface Using Convolutional Neural Networks. IEEE Transactions on Neural Networks and Learning Systems. https://doi.org/10.1109/TNNLS.2018.2789927</w:t>
+        <w:t>Siavash Sakhavi, Cuntai Guan, Shuicheng Yan. (2018). Learning Temporal Information for Brain-Computer Interface Using Convolutional Neural Networks. IEEE Transactions on Neural Networks and Learning Systems. https://doi.org/10.1109/tnnls.2018.2789927</w:t>
       </w:r>
     </w:p>
     <w:p>
@@ -941,7 +941,7 @@
         <w:pStyle w:val="ListNumber"/>
       </w:pPr>
       <w:r>
-        <w:t>Hamdi Altaheri, G. Muhammad, Mansour Alsulaiman. (2023). Physics-Informed Attention Temporal Convolutional Network for EEG-Based Motor Imagery Classification. IEEE Transactions on Industrial Informatics. https://doi.org/10.1109/TII.2022.3197419</w:t>
+        <w:t>Hamdi Altaheri, G. Muhammad, Mansour Alsulaiman. (2023). Physics-Informed Attention Temporal Convolutional Network for EEG-Based Motor Imagery Classification. IEEE Transactions on Industrial Informatics. https://doi.org/10.1109/tii.2022.3197419</w:t>
       </w:r>
     </w:p>
     <w:p>
@@ -949,7 +949,7 @@
         <w:pStyle w:val="ListNumber"/>
       </w:pPr>
       <w:r>
-        <w:t>Wei-Bang Jiang, Li-Ming Zhao, Bao-Liang Lu. (2024). Large Brain Model for Learning Generic Representations with Tremendous EEG Data in BCI. International Conference on Learning Representations. https://doi.org/10.48550/arXiv.2405.18765</w:t>
+        <w:t>Wei-Bang Jiang, Li-Ming Zhao, Bao-Liang Lu. (2024). Large Brain Model for Learning Generic Representations with Tremendous EEG Data in BCI. International Conference on Learning Representations. https://doi.org/10.48550/arxiv.2405.18765</w:t>
       </w:r>
     </w:p>
     <w:p>
@@ -965,7 +965,7 @@
         <w:pStyle w:val="ListNumber"/>
       </w:pPr>
       <w:r>
-        <w:t>Dingkun Liu, Yuheng Chen, Zhu Chen, Zhenyao Cui, Yaozhi Wen, Jiayu An, et al.. (2026). EEG Foundation Models: Progresses, Benchmarking, and Open Problems. arXiv.org. https://doi.org/10.48550/arXiv.2601.17883</w:t>
+        <w:t>Dingkun Liu, Yuheng Chen, Zhu Chen, Zhenyao Cui, Yaozhi Wen, Jiayu An, et al.. (2026). EEG Foundation Models: Progresses, Benchmarking, and Open Problems. arXiv.org. https://doi.org/10.48550/arxiv.2601.17883</w:t>
       </w:r>
     </w:p>
     <w:sectPr>

</xml_diff>

<commit_message>
Add GitHub keyword filter
</commit_message>
<xml_diff>
--- a/paper/review_en.docx
+++ b/paper/review_en.docx
@@ -12,7 +12,7 @@
     </w:p>
     <w:p>
       <w:r>
-        <w:t>Generated: 2026-06-26 | Dataset: 2447 papers</w:t>
+        <w:t>Generated: 2026-06-27 | Dataset: 2447 papers</w:t>
       </w:r>
     </w:p>
     <w:p>
@@ -38,7 +38,7 @@
     </w:p>
     <w:p>
       <w:r>
-        <w:t>Methods: For each year, BCI-oriented queries were sent to the Semantic Scholar Academic Graph bulk search endpoint. Records were retained when their title or abstract matched BCI relevance expressions, deduplicated by DOI, arXiv, PubMed, CorpusId, or paperId, and reduced to at most 500 candidate papers per year. The final 100 papers per year were selected by citation count, with influential citation count and the metadata importance score retained as tie-breakers and audit signals. The importance score combines log-scaled citations, log-scaled influential citations, recognized venue signals, BCI relevance-term density, and bonuses for reviews/surveys, datasets/benchmarks, clinical or rehabilitation relevance, invasive high-bandwidth BCIs, and modern machine-learning methods. The year 2026 should be interpreted as a partial year as of 2026-06-26.</w:t>
+        <w:t>Methods: For each year, BCI-oriented queries were sent to the Semantic Scholar Academic Graph bulk search endpoint. Records were retained when their title or abstract matched BCI relevance expressions, deduplicated by DOI, arXiv, PubMed, CorpusId, or paperId, and reduced to at most 500 candidate papers per year. The final 100 papers per year were selected by citation count, with influential citation count and the metadata importance score retained as tie-breakers and audit signals. The importance score combines log-scaled citations, log-scaled influential citations, recognized venue signals, BCI relevance-term density, and bonuses for reviews/surveys, datasets/benchmarks, clinical or rehabilitation relevance, invasive high-bandwidth BCIs, and modern machine-learning methods. The year 2026 should be interpreted as a partial year as of 2026-06-27.</w:t>
       </w:r>
     </w:p>
     <w:p>

</xml_diff>